<commit_message>
Handled errors in 'runSimu', update protocol
</commit_message>
<xml_diff>
--- a/inst/simStudyProtocol - Appendix B - breakpoints distribution.docx
+++ b/inst/simStudyProtocol - Appendix B - breakpoints distribution.docx
@@ -489,10 +489,17 @@
     </w:p>
     <w:p>
       <w:pPr>
-        <w:rPr>
-          <w:lang w:val="en-US"/>
-        </w:rPr>
-      </w:pPr>
+        <w:ind w:firstLine="709"/>
+        <w:rPr>
+          <w:lang w:val="en-US"/>
+        </w:rPr>
+      </w:pPr>
+      <w:r>
+        <w:rPr>
+          <w:lang w:val="en-US"/>
+        </w:rPr>
+        <w:t>It is not much desirable from a simulation perspective, since we then don’t control the time-variability of all breakpoints but the first one.</w:t>
+      </w:r>
       <w:r>
         <w:rPr>
           <w:lang w:val="en-US"/>
@@ -546,7 +553,31 @@
         <w:rPr>
           <w:lang w:val="en-US"/>
         </w:rPr>
-        <w:t>If simulating the slopes coefficients directly is possible, is raises some issues due to the limited range of the SDI scale (0-10). It is mostly desirable to simulate breakpoints</w:t>
+        <w:t xml:space="preserve">If simulating the slopes coefficients directly is possible, </w:t>
+      </w:r>
+      <w:r>
+        <w:rPr>
+          <w:lang w:val="en-US"/>
+        </w:rPr>
+        <w:t>though it</w:t>
+      </w:r>
+      <w:r>
+        <w:rPr>
+          <w:lang w:val="en-US"/>
+        </w:rPr>
+        <w:t xml:space="preserve"> raises some issues due to the limited range of the SDI scale (0-10). </w:t>
+      </w:r>
+      <w:r>
+        <w:rPr>
+          <w:lang w:val="en-US"/>
+        </w:rPr>
+        <w:t>Considering the bounds of SDI scale, i</w:t>
+      </w:r>
+      <w:r>
+        <w:rPr>
+          <w:lang w:val="en-US"/>
+        </w:rPr>
+        <w:t>t is mostly desirable to simulate breakpoints</w:t>
       </w:r>
       <w:r>
         <w:rPr>
@@ -558,26 +589,13 @@
         <w:rPr>
           <w:lang w:val="en-US"/>
         </w:rPr>
-        <w:t>??</w:t>
+        <w:t>.</w:t>
       </w:r>
       <w:r>
         <w:rPr>
           <w:lang w:val="en-US"/>
         </w:rPr>
         <w:t xml:space="preserve"> </w:t>
-      </w:r>
-      <w:r>
-        <w:rPr>
-          <w:highlight w:val="yellow"/>
-          <w:lang w:val="en-US"/>
-        </w:rPr>
-        <w:t>Is it??</w:t>
-      </w:r>
-      <w:r>
-        <w:rPr>
-          <w:lang w:val="en-US"/>
-        </w:rPr>
-        <w:t xml:space="preserve"> Problematic resides in the boundaries of the domain (time &gt; 0, 0&lt; SDI &lt; 10, breakpoints are ordered and distance between them is strictly positive).</w:t>
       </w:r>
     </w:p>
     <w:p>
@@ -591,7 +609,19 @@
         <w:rPr>
           <w:lang w:val="en-US"/>
         </w:rPr>
-        <w:t>However, the slopes are the ratio of the y/x coordinates of breakpoints, so we don’t know the exact distribution of this quantity. On idea is drawing x and y jointly through and multivariate normal law. With a proper correlation specification, we could set up at least the average value of the ratio:</w:t>
+        <w:t>However, the slopes are the ratio of the y/x coordinates of breakpoints, so we don’t know the exact distribution of this quantity. On idea is drawing x and y jointly through a</w:t>
+      </w:r>
+      <w:r>
+        <w:rPr>
+          <w:lang w:val="en-US"/>
+        </w:rPr>
+        <w:t xml:space="preserve"> </w:t>
+      </w:r>
+      <w:r>
+        <w:rPr>
+          <w:lang w:val="en-US"/>
+        </w:rPr>
+        <w:t>multivariate normal law. With a proper correlation specification, we could set up at least the average value of the ratio:</w:t>
       </w:r>
     </w:p>
     <w:p>
@@ -2777,7 +2807,21 @@
           <w:rFonts w:eastAsiaTheme="minorEastAsia"/>
           <w:lang w:val="en-US"/>
         </w:rPr>
-        <w:t xml:space="preserve"> since the proper value would then be 4.65, yielding in the following distribution:</w:t>
+        <w:t xml:space="preserve"> since the </w:t>
+      </w:r>
+      <w:r>
+        <w:rPr>
+          <w:rFonts w:eastAsiaTheme="minorEastAsia"/>
+          <w:lang w:val="en-US"/>
+        </w:rPr>
+        <w:t>correct</w:t>
+      </w:r>
+      <w:r>
+        <w:rPr>
+          <w:rFonts w:eastAsiaTheme="minorEastAsia"/>
+          <w:lang w:val="en-US"/>
+        </w:rPr>
+        <w:t xml:space="preserve"> value would then be 4.65, yielding in the following distribution:</w:t>
       </w:r>
     </w:p>
     <w:p>

</xml_diff>

<commit_message>
Updated simulation protocol and initiated 3 script for results analysis 'simuAnalysis*.R'
</commit_message>
<xml_diff>
--- a/inst/simStudyProtocol - Appendix B - breakpoints distribution.docx
+++ b/inst/simStudyProtocol - Appendix B - breakpoints distribution.docx
@@ -62,52 +62,8 @@
         <w:rPr>
           <w:lang w:val="en-US"/>
         </w:rPr>
-        <w:t>/</w:t>
-      </w:r>
-      <w:proofErr w:type="spellStart"/>
-      <w:r>
-        <w:rPr>
-          <w:lang w:val="en-US"/>
-        </w:rPr>
-        <w:t>github</w:t>
-      </w:r>
-      <w:proofErr w:type="spellEnd"/>
-      <w:r>
-        <w:rPr>
-          <w:lang w:val="en-US"/>
-        </w:rPr>
-        <w:t>/</w:t>
-      </w:r>
-      <w:proofErr w:type="spellStart"/>
-      <w:r>
-        <w:rPr>
-          <w:lang w:val="en-US"/>
-        </w:rPr>
-        <w:t>mixedBreak</w:t>
-      </w:r>
-      <w:proofErr w:type="spellEnd"/>
-      <w:r>
-        <w:rPr>
-          <w:lang w:val="en-US"/>
-        </w:rPr>
-        <w:t>/test/</w:t>
-      </w:r>
-      <w:proofErr w:type="spellStart"/>
-      <w:r>
-        <w:rPr>
-          <w:lang w:val="en-US"/>
-        </w:rPr>
-        <w:t>distrib-</w:t>
-      </w:r>
-      <w:proofErr w:type="gramStart"/>
-      <w:r>
-        <w:rPr>
-          <w:lang w:val="en-US"/>
-        </w:rPr>
-        <w:t>breaks.R</w:t>
-      </w:r>
-      <w:proofErr w:type="spellEnd"/>
-      <w:proofErr w:type="gramEnd"/>
+        <w:t>/github/mixedBreak/test/distrib-breaks.R</w:t>
+      </w:r>
     </w:p>
     <w:p>
       <w:pPr>
@@ -198,21 +154,7 @@
         <w:rPr>
           <w:lang w:val="en-US"/>
         </w:rPr>
-        <w:t xml:space="preserve">in </w:t>
-      </w:r>
-      <w:proofErr w:type="spellStart"/>
-      <w:r>
-        <w:rPr>
-          <w:lang w:val="en-US"/>
-        </w:rPr>
-        <w:t>Stenbæck</w:t>
-      </w:r>
-      <w:proofErr w:type="spellEnd"/>
-      <w:r>
-        <w:rPr>
-          <w:lang w:val="en-US"/>
-        </w:rPr>
-        <w:t xml:space="preserve"> et al. (</w:t>
+        <w:t>in Stenbæck et al. (</w:t>
       </w:r>
       <w:hyperlink r:id="rId6" w:history="1">
         <w:r>
@@ -239,21 +181,7 @@
         <w:rPr>
           <w:lang w:val="en-US"/>
         </w:rPr>
-        <w:t xml:space="preserve"> (mean (</w:t>
-      </w:r>
-      <w:proofErr w:type="spellStart"/>
-      <w:r>
-        <w:rPr>
-          <w:lang w:val="en-US"/>
-        </w:rPr>
-        <w:t>sd</w:t>
-      </w:r>
-      <w:proofErr w:type="spellEnd"/>
-      <w:r>
-        <w:rPr>
-          <w:lang w:val="en-US"/>
-        </w:rPr>
-        <w:t>) [range] in minutes after drug intake):</w:t>
+        <w:t xml:space="preserve"> (mean (sd) [range] in minutes after drug intake):</w:t>
       </w:r>
     </w:p>
     <w:p>
@@ -278,21 +206,7 @@
         <w:rPr>
           <w:lang w:val="en-US"/>
         </w:rPr>
-        <w:t>77.2 (38.2) [</w:t>
-      </w:r>
-      <w:proofErr w:type="gramStart"/>
-      <w:r>
-        <w:rPr>
-          <w:lang w:val="en-US"/>
-        </w:rPr>
-        <w:t>32.5 ;</w:t>
-      </w:r>
-      <w:proofErr w:type="gramEnd"/>
-      <w:r>
-        <w:rPr>
-          <w:lang w:val="en-US"/>
-        </w:rPr>
-        <w:t xml:space="preserve"> 157.9]</w:t>
+        <w:t>77.2 (38.2) [32.5 ; 157.9]</w:t>
       </w:r>
     </w:p>
     <w:p>
@@ -317,21 +231,7 @@
         <w:rPr>
           <w:lang w:val="en-US"/>
         </w:rPr>
-        <w:t>77.5 (33.3) [</w:t>
-      </w:r>
-      <w:proofErr w:type="gramStart"/>
-      <w:r>
-        <w:rPr>
-          <w:lang w:val="en-US"/>
-        </w:rPr>
-        <w:t>29.0 ;</w:t>
-      </w:r>
-      <w:proofErr w:type="gramEnd"/>
-      <w:r>
-        <w:rPr>
-          <w:lang w:val="en-US"/>
-        </w:rPr>
-        <w:t xml:space="preserve"> 142.8]</w:t>
+        <w:t>77.5 (33.3) [29.0 ; 142.8]</w:t>
       </w:r>
     </w:p>
     <w:p>
@@ -356,21 +256,7 @@
         <w:rPr>
           <w:lang w:val="en-US"/>
         </w:rPr>
-        <w:t>131.6 (39.3) [</w:t>
-      </w:r>
-      <w:proofErr w:type="gramStart"/>
-      <w:r>
-        <w:rPr>
-          <w:lang w:val="en-US"/>
-        </w:rPr>
-        <w:t>90.0 ;</w:t>
-      </w:r>
-      <w:proofErr w:type="gramEnd"/>
-      <w:r>
-        <w:rPr>
-          <w:lang w:val="en-US"/>
-        </w:rPr>
-        <w:t xml:space="preserve"> 204.1]</w:t>
+        <w:t>131.6 (39.3) [90.0 ; 204.1]</w:t>
       </w:r>
     </w:p>
     <w:p>
@@ -925,71 +811,13 @@
         <w:rPr>
           <w:lang w:val="en-US"/>
         </w:rPr>
-        <w:t xml:space="preserve"> - (</w:t>
-      </w:r>
-      <w:proofErr w:type="spellStart"/>
-      <w:proofErr w:type="gramStart"/>
-      <w:r>
-        <w:rPr>
-          <w:lang w:val="en-US"/>
-        </w:rPr>
-        <w:t>x,y</w:t>
-      </w:r>
-      <w:proofErr w:type="spellEnd"/>
-      <w:proofErr w:type="gramEnd"/>
-      <w:r>
-        <w:rPr>
-          <w:lang w:val="en-US"/>
-        </w:rPr>
-        <w:t xml:space="preserve">) multivariate normal distribution with means = (63.9,9), </w:t>
-      </w:r>
-      <w:proofErr w:type="spellStart"/>
-      <w:r>
-        <w:rPr>
-          <w:lang w:val="en-US"/>
-        </w:rPr>
-        <w:t>sd</w:t>
-      </w:r>
-      <w:proofErr w:type="spellEnd"/>
-      <w:r>
-        <w:rPr>
-          <w:lang w:val="en-US"/>
-        </w:rPr>
-        <w:t>=(</w:t>
-      </w:r>
-      <w:proofErr w:type="gramStart"/>
-      <w:r>
-        <w:rPr>
-          <w:lang w:val="en-US"/>
-        </w:rPr>
-        <w:t>sqrt(</w:t>
-      </w:r>
-      <w:proofErr w:type="gramEnd"/>
-      <w:r>
-        <w:rPr>
-          <w:lang w:val="en-US"/>
-        </w:rPr>
-        <w:t>33),1) and rho = 0 (left) and 0.81 (right)</w:t>
-      </w:r>
-      <w:r>
-        <w:rPr>
-          <w:lang w:val="en-US"/>
-        </w:rPr>
-        <w:t xml:space="preserve">. Black line is the target with coefficient </w:t>
-      </w:r>
-      <w:proofErr w:type="spellStart"/>
-      <w:r>
-        <w:rPr>
-          <w:lang w:val="en-US"/>
-        </w:rPr>
-        <w:t>beta_onset</w:t>
-      </w:r>
-      <w:proofErr w:type="spellEnd"/>
-      <w:r>
-        <w:rPr>
-          <w:lang w:val="en-US"/>
-        </w:rPr>
-        <w:t>, and red line is the BLUP of y given x and rho.</w:t>
+        <w:t xml:space="preserve"> - (x,y) multivariate normal distribution with means = (63.9,9), sd=(sqrt(33),1) and rho = 0 (left) and 0.81 (right)</w:t>
+      </w:r>
+      <w:r>
+        <w:rPr>
+          <w:lang w:val="en-US"/>
+        </w:rPr>
+        <w:t>. Black line is the target with coefficient beta_onset, and red line is the BLUP of y given x and rho.</w:t>
       </w:r>
       <w:r>
         <w:rPr>
@@ -1085,35 +913,7 @@
         <w:rPr>
           <w:lang w:val="en-US"/>
         </w:rPr>
-        <w:t xml:space="preserve"> - Empirical distribution of ratio y/x. In red is the density of normal law with mean = mean(y/x) and </w:t>
-      </w:r>
-      <w:proofErr w:type="spellStart"/>
-      <w:r>
-        <w:rPr>
-          <w:lang w:val="en-US"/>
-        </w:rPr>
-        <w:t>sd</w:t>
-      </w:r>
-      <w:proofErr w:type="spellEnd"/>
-      <w:r>
-        <w:rPr>
-          <w:lang w:val="en-US"/>
-        </w:rPr>
-        <w:t xml:space="preserve"> = </w:t>
-      </w:r>
-      <w:proofErr w:type="spellStart"/>
-      <w:r>
-        <w:rPr>
-          <w:lang w:val="en-US"/>
-        </w:rPr>
-        <w:t>sd</w:t>
-      </w:r>
-      <w:proofErr w:type="spellEnd"/>
-      <w:r>
-        <w:rPr>
-          <w:lang w:val="en-US"/>
-        </w:rPr>
-        <w:t>(y/x)</w:t>
+        <w:t xml:space="preserve"> - Empirical distribution of ratio y/x. In red is the density of normal law with mean = mean(y/x) and sd = sd(y/x)</w:t>
       </w:r>
       <w:r>
         <w:rPr>
@@ -2944,7 +2744,19 @@
         <w:rPr>
           <w:lang w:val="en-US"/>
         </w:rPr>
-        <w:t xml:space="preserve"> setup when the condition on ratio of standard deviation.</w:t>
+        <w:t xml:space="preserve"> setup when the condition on ratio of standard deviation</w:t>
+      </w:r>
+      <w:r>
+        <w:rPr>
+          <w:lang w:val="en-US"/>
+        </w:rPr>
+        <w:t xml:space="preserve"> is not met</w:t>
+      </w:r>
+      <w:r>
+        <w:rPr>
+          <w:lang w:val="en-US"/>
+        </w:rPr>
+        <w:t>.</w:t>
       </w:r>
     </w:p>
     <w:p>
@@ -2972,21 +2784,7 @@
         <w:rPr>
           <w:lang w:val="en-US"/>
         </w:rPr>
-        <w:t xml:space="preserve">: Is there any for rho such that we can control the mean and/or </w:t>
-      </w:r>
-      <w:proofErr w:type="spellStart"/>
-      <w:r>
-        <w:rPr>
-          <w:lang w:val="en-US"/>
-        </w:rPr>
-        <w:t>sd</w:t>
-      </w:r>
-      <w:proofErr w:type="spellEnd"/>
-      <w:r>
-        <w:rPr>
-          <w:lang w:val="en-US"/>
-        </w:rPr>
-        <w:t xml:space="preserve"> of the ratio y/x?</w:t>
+        <w:t>: Is there any for rho such that we can control the mean and/or sd of the ratio y/x?</w:t>
       </w:r>
       <w:r>
         <w:rPr>

</xml_diff>

<commit_message>
V0 of simStudyReport Need to add diff values of cor(slope, meq)
</commit_message>
<xml_diff>
--- a/inst/simStudyProtocol - Appendix B - breakpoints distribution.docx
+++ b/inst/simStudyProtocol - Appendix B - breakpoints distribution.docx
@@ -1886,7 +1886,21 @@
           <w:rFonts w:eastAsiaTheme="minorEastAsia"/>
           <w:lang w:val="en-US"/>
         </w:rPr>
-        <w:t xml:space="preserve"> would average the desired value. </w:t>
+        <w:t xml:space="preserve"> </w:t>
+      </w:r>
+      <w:r>
+        <w:rPr>
+          <w:rFonts w:eastAsiaTheme="minorEastAsia"/>
+          <w:lang w:val="en-US"/>
+        </w:rPr>
+        <w:t xml:space="preserve"> (of breakpoint coordinate) </w:t>
+      </w:r>
+      <w:r>
+        <w:rPr>
+          <w:rFonts w:eastAsiaTheme="minorEastAsia"/>
+          <w:lang w:val="en-US"/>
+        </w:rPr>
+        <w:t xml:space="preserve">would average the desired value. </w:t>
       </w:r>
       <w:r>
         <w:rPr>

</xml_diff>